<commit_message>
feat(dbt): Onda 1 — materializações, governança, python e auditoria de projeto
- groups + access (governança de modelos): staging/intermediate protected, marts public
- constraints no warehouse (PK/CHECK via contract enforced) em dim_date/dims/fato
- model ephemeral int_duplicate_flags (CTE inlinada; separa duplicidade de enriquecimento)
- python model py_plaza_audit_stats (pandas: taxa de suspeita + z-score por praça)
- versioned model rpt_plaza_revenue v1(deprecada)→v2(latest, +ticket médio)
- dbt_project_evaluator (auditoria de best practices, severity warn)
- ADR-18..24 + doc Word regenerada (anti-drift verde: 24 ADRs, 33 arquivos)

Build: PASS=198 WARN=15 (14 evaluator + 1 intencional) ERROR=0.

Co-Authored-By: Claude Opus 4.8 <noreply@anthropic.com>
</commit_message>
<xml_diff>
--- a/dbt-toll-analytics/docs/Documentacao_dbt_toll_analytics.docx
+++ b/dbt-toll-analytics/docs/Documentacao_dbt_toll_analytics.docx
@@ -2410,6 +2410,47 @@
     </w:p>
     <w:p>
       <w:pPr>
+        <w:spacing w:before="160" w:after="40"/>
+      </w:pPr>
+      <w:r>
+        <w:rPr>
+          <w:b/>
+          <w:color w:val="1F4E79"/>
+          <w:sz w:val="23"/>
+        </w:rPr>
+        <w:t>int_duplicate_flags.sql (EPHEMERAL)</w:t>
+      </w:r>
+    </w:p>
+    <w:p>
+      <w:pPr>
+        <w:spacing w:after="40"/>
+      </w:pPr>
+      <w:r>
+        <w:rPr>
+          <w:b/>
+        </w:rPr>
+        <w:t xml:space="preserve">O que é / para que serve: </w:t>
+      </w:r>
+      <w:r>
+        <w:t>Detecção de duplicidade na janela, materializada como EPHEMERAL: não vira objeto no banco — o dbt inlina como CTE em quem der ref().</w:t>
+      </w:r>
+    </w:p>
+    <w:p>
+      <w:pPr>
+        <w:spacing w:after="40"/>
+      </w:pPr>
+      <w:r>
+        <w:rPr>
+          <w:b/>
+        </w:rPr>
+        <w:t xml:space="preserve">Por que existe: </w:t>
+      </w:r>
+      <w:r>
+        <w:t>Separa 'achar duplicata' de 'enriquecer', deixando o int_transactions_enriched mais limpo. Uso clássico de ephemeral (passo lógico reutilizável e barato). Ver ADR-20.</w:t>
+      </w:r>
+    </w:p>
+    <w:p>
+      <w:pPr>
         <w:pStyle w:val="Heading2"/>
       </w:pPr>
       <w:r>
@@ -2417,6 +2458,47 @@
           <w:color w:val="1F4E79"/>
         </w:rPr>
         <w:t>6.5. models/marts/ — camada GOLD (consumo)</w:t>
+      </w:r>
+    </w:p>
+    <w:p>
+      <w:pPr>
+        <w:spacing w:before="160" w:after="40"/>
+      </w:pPr>
+      <w:r>
+        <w:rPr>
+          <w:b/>
+          <w:color w:val="1F4E79"/>
+          <w:sz w:val="23"/>
+        </w:rPr>
+        <w:t>_groups.yml (groups + access)</w:t>
+      </w:r>
+    </w:p>
+    <w:p>
+      <w:pPr>
+        <w:spacing w:after="40"/>
+      </w:pPr>
+      <w:r>
+        <w:rPr>
+          <w:b/>
+        </w:rPr>
+        <w:t xml:space="preserve">O que é / para que serve: </w:t>
+      </w:r>
+      <w:r>
+        <w:t>Define os GROUPS (staging/intermediate/marts) com dono e o ACCESS de cada camada: interno 'protected', marts 'public'.</w:t>
+      </w:r>
+    </w:p>
+    <w:p>
+      <w:pPr>
+        <w:spacing w:after="40"/>
+      </w:pPr>
+      <w:r>
+        <w:rPr>
+          <w:b/>
+        </w:rPr>
+        <w:t xml:space="preserve">Por que existe: </w:t>
+      </w:r>
+      <w:r>
+        <w:t>Governança de modelos: deixa explícito o que é consumível (marts public) e o que é interno do package (protected). Ver ADR-18.</w:t>
       </w:r>
     </w:p>
     <w:p>
@@ -2677,6 +2759,88 @@
       </w:r>
       <w:r>
         <w:t>É a entrega de valor do projeto. Usa a macro audit_flag e filtra onde a flag é diferente de OK.</w:t>
+      </w:r>
+    </w:p>
+    <w:p>
+      <w:pPr>
+        <w:spacing w:before="160" w:after="40"/>
+      </w:pPr>
+      <w:r>
+        <w:rPr>
+          <w:b/>
+          <w:color w:val="1F4E79"/>
+          <w:sz w:val="23"/>
+        </w:rPr>
+        <w:t>py_plaza_audit_stats.py (PYTHON MODEL)</w:t>
+      </w:r>
+    </w:p>
+    <w:p>
+      <w:pPr>
+        <w:spacing w:after="40"/>
+      </w:pPr>
+      <w:r>
+        <w:rPr>
+          <w:b/>
+        </w:rPr>
+        <w:t xml:space="preserve">O que é / para que serve: </w:t>
+      </w:r>
+      <w:r>
+        <w:t>Python model (dbt-duckdb): estatística de auditoria por praça (total, suspeitas, taxa, vazamento e z-score da taxa entre praças), em pandas.</w:t>
+      </w:r>
+    </w:p>
+    <w:p>
+      <w:pPr>
+        <w:spacing w:after="40"/>
+      </w:pPr>
+      <w:r>
+        <w:rPr>
+          <w:b/>
+        </w:rPr>
+        <w:t xml:space="preserve">Por que existe: </w:t>
+      </w:r>
+      <w:r>
+        <w:t>Mostra que o dbt orquestra/testa/versiona Python igual a SQL. Estatística (z-score entre praças) é natural em pandas. Ver ADR-21.</w:t>
+      </w:r>
+    </w:p>
+    <w:p>
+      <w:pPr>
+        <w:spacing w:before="160" w:after="40"/>
+      </w:pPr>
+      <w:r>
+        <w:rPr>
+          <w:b/>
+          <w:color w:val="1F4E79"/>
+          <w:sz w:val="23"/>
+        </w:rPr>
+        <w:t>rpt_plaza_revenue_v1.sql / rpt_plaza_revenue_v2.sql (VERSIONED)</w:t>
+      </w:r>
+    </w:p>
+    <w:p>
+      <w:pPr>
+        <w:spacing w:after="40"/>
+      </w:pPr>
+      <w:r>
+        <w:rPr>
+          <w:b/>
+        </w:rPr>
+        <w:t xml:space="preserve">O que é / para que serve: </w:t>
+      </w:r>
+      <w:r>
+        <w:t>Model VERSIONADO de report: v1 (deprecada em 2026-12-31) e v2 (latest, adiciona ticket médio).</w:t>
+      </w:r>
+    </w:p>
+    <w:p>
+      <w:pPr>
+        <w:spacing w:after="40"/>
+      </w:pPr>
+      <w:r>
+        <w:rPr>
+          <w:b/>
+        </w:rPr>
+        <w:t xml:space="preserve">Por que existe: </w:t>
+      </w:r>
+      <w:r>
+        <w:t>Quebra de contrato via VERSÃO, não in-place: consumidores migram no seu ritmo. ref('rpt_plaza_revenue') resolve para a latest_version (v2). Ver ADR-22.</w:t>
       </w:r>
     </w:p>
     <w:p>
@@ -4009,6 +4173,111 @@
       </w:r>
       <w:r>
         <w:t>O teste de anomalia ganhou a tag 'observability'; o CI de PR roda 'dbt build --exclude tag:observability' (determinístico, PASS=124) e um workflow agendado roda a detecção de anomalia. Motivo: anomalia precisa de histórico acumulado e o autoupload do Elementary no DuckDB dispara erro de commit. Monitoramento contínuo não é gate de merge.</w:t>
+      </w:r>
+    </w:p>
+    <w:p>
+      <w:pPr>
+        <w:spacing w:after="100"/>
+      </w:pPr>
+      <w:r>
+        <w:rPr>
+          <w:b/>
+          <w:color w:val="1F4E79"/>
+        </w:rPr>
+        <w:t xml:space="preserve">ADR-18 — Groups + access (governança de modelos): </w:t>
+      </w:r>
+      <w:r>
+        <w:t>Cada model pertence a um group (staging/intermediate/marts) com dono, e tem nível de access: o interno fica 'protected' (só o package referencia) e os marts ficam 'public' (camada consumível por BI/Semantic Layer/exposures). Documenta as fronteiras de consumo. 'private' não se aplica porque os refs cruzam grupos.</w:t>
+      </w:r>
+    </w:p>
+    <w:p>
+      <w:pPr>
+        <w:spacing w:after="100"/>
+      </w:pPr>
+      <w:r>
+        <w:rPr>
+          <w:b/>
+          <w:color w:val="1F4E79"/>
+        </w:rPr>
+        <w:t xml:space="preserve">ADR-19 — Constraints no warehouse (PK/CHECK via contract): </w:t>
+      </w:r>
+      <w:r>
+        <w:t>Com contract enforced, declaramos constraints (primary_key, not_null, check) que viram DDL REAL na CREATE TABLE — o banco passa a garantir a invariante, não só o teste dbt. PK no grão do fato e das dims; CHECK em dim_date (mês 1..12, dia da semana 0..6).</w:t>
+      </w:r>
+    </w:p>
+    <w:p>
+      <w:pPr>
+        <w:spacing w:after="100"/>
+      </w:pPr>
+      <w:r>
+        <w:rPr>
+          <w:b/>
+          <w:color w:val="1F4E79"/>
+        </w:rPr>
+        <w:t xml:space="preserve">ADR-20 — Model ephemeral (int_duplicate_flags): </w:t>
+      </w:r>
+      <w:r>
+        <w:t>A detecção de duplicidade virou um model EPHEMERAL: não materializa objeto no banco — o dbt inlina como CTE em quem der ref(). Separa 'achar duplicata' de 'enriquecer'. Uso clássico de ephemeral: passo lógico reutilizável e barato que não precisa ser consultado isoladamente.</w:t>
+      </w:r>
+    </w:p>
+    <w:p>
+      <w:pPr>
+        <w:spacing w:after="100"/>
+      </w:pPr>
+      <w:r>
+        <w:rPr>
+          <w:b/>
+          <w:color w:val="1F4E79"/>
+        </w:rPr>
+        <w:t xml:space="preserve">ADR-21 — Python model (py_plaza_audit_stats): </w:t>
+      </w:r>
+      <w:r>
+        <w:t>Um model em PYTHON (dbt-duckdb) calcula estatística de auditoria por praça (taxa de suspeita e z-score entre praças) em pandas. O dbt orquestra/testa/versiona Python igual a SQL; usamos Python onde é natural (estatística), não por moda.</w:t>
+      </w:r>
+    </w:p>
+    <w:p>
+      <w:pPr>
+        <w:spacing w:after="100"/>
+      </w:pPr>
+      <w:r>
+        <w:rPr>
+          <w:b/>
+          <w:color w:val="1F4E79"/>
+        </w:rPr>
+        <w:t xml:space="preserve">ADR-22 — Versioned model + deprecation_date: </w:t>
+      </w:r>
+      <w:r>
+        <w:t>rpt_plaza_revenue é VERSIONADO: a v2 (latest) adiciona ticket médio; a v1 fica deprecada até 2026-12-31. Quebra de contrato via VERSÃO, não in-place — os consumidores migram no seu ritmo. ref() resolve para a latest_version.</w:t>
+      </w:r>
+    </w:p>
+    <w:p>
+      <w:pPr>
+        <w:spacing w:after="100"/>
+      </w:pPr>
+      <w:r>
+        <w:rPr>
+          <w:b/>
+          <w:color w:val="1F4E79"/>
+        </w:rPr>
+        <w:t xml:space="preserve">ADR-23 — dbt_project_evaluator como warn: </w:t>
+      </w:r>
+      <w:r>
+        <w:t>Adicionamos o pacote que audita o PRÓPRIO projeto contra best practices (naming, fanout, undocumented, modelos públicos sem contract...). As descobertas ficam como 'warn' — recomendações de melhoria contínua monitoráveis, não gate de merge.</w:t>
+      </w:r>
+    </w:p>
+    <w:p>
+      <w:pPr>
+        <w:spacing w:after="100"/>
+      </w:pPr>
+      <w:r>
+        <w:rPr>
+          <w:b/>
+          <w:color w:val="1F4E79"/>
+        </w:rPr>
+        <w:t xml:space="preserve">ADR-24 — Materializações/grants só no target prod (Databricks): </w:t>
+      </w:r>
+      <w:r>
+        <w:t>materialized_view, estratégia incremental microbatch e grants são features do warehouse de produção (Databricks/Delta), não do DuckDB single-node de dev. Em vez de falsear no dev, ficam documentadas/config no target prod. No DuckDB rodam as materializações que ele suporta (view/table/incremental/ephemeral).</w:t>
       </w:r>
     </w:p>
     <w:p>

</xml_diff>

<commit_message>
feat: Onda 3 (acabamento) — Slim CI, saved queries, docs blocks (dbt) + sensor/setup-teardown/Astro (airflow)
dbt:
- docs blocks ({% docs %} em models/docs.md + doc()) e +persist_docs (COMMENT no DuckDB, validado)
- saved_queries + exports no Semantic Layer (revenue_daily); mf validate-configs ok
- Slim CI: workflow dbt_slim_ci.yml (state:modified+ --defer vs manifest da base)
- ADR-25/26/27; doc Word regenerada (anti-drift: 27 ADRs, 33 arquivos)

airflow:
- DAG toll_analytics_maintenance: Sensor (@task.sensor) + Setup/Teardown tasks (schema efêmero)
- Astro CLI: airflow_settings.yaml (pools/vars/connections) + packages.txt
- ADR-A6 (sensor/setup-teardown) e ADR-A7 (Slack provider opcional); DAG integrity cobre 5 DAGs

Validado: dbt build PASS=198 ERROR=0; dags test maintenance state=success; pytest 3 passed.

Co-Authored-By: Claude Opus 4.8 <noreply@anthropic.com>
</commit_message>
<xml_diff>
--- a/dbt-toll-analytics/docs/Documentacao_dbt_toll_analytics.docx
+++ b/dbt-toll-analytics/docs/Documentacao_dbt_toll_analytics.docx
@@ -4278,6 +4278,51 @@
       </w:r>
       <w:r>
         <w:t>materialized_view, estratégia incremental microbatch e grants são features do warehouse de produção (Databricks/Delta), não do DuckDB single-node de dev. Em vez de falsear no dev, ficam documentadas/config no target prod. No DuckDB rodam as materializações que ele suporta (view/table/incremental/ephemeral).</w:t>
+      </w:r>
+    </w:p>
+    <w:p>
+      <w:pPr>
+        <w:spacing w:after="100"/>
+      </w:pPr>
+      <w:r>
+        <w:rPr>
+          <w:b/>
+          <w:color w:val="1F4E79"/>
+        </w:rPr>
+        <w:t xml:space="preserve">ADR-25 — Docs blocks + persist_docs: </w:t>
+      </w:r>
+      <w:r>
+        <w:t>Descrições reutilizáveis viram docs blocks ({% docs %} em models/docs.md, referenciados com doc()), e +persist_docs empurra as descrições para COMMENTs no banco. Documentação versionada, sem duplicação, que vive junto do dado. Validado: o COMMENT do audit_flag no DuckDB traz o docs block renderizado.</w:t>
+      </w:r>
+    </w:p>
+    <w:p>
+      <w:pPr>
+        <w:spacing w:after="100"/>
+      </w:pPr>
+      <w:r>
+        <w:rPr>
+          <w:b/>
+          <w:color w:val="1F4E79"/>
+        </w:rPr>
+        <w:t xml:space="preserve">ADR-26 — Saved queries + exports (Semantic Layer): </w:t>
+      </w:r>
+      <w:r>
+        <w:t>Uma saved query (revenue_daily) agrupa métricas + recorte + export no Semantic Layer — consulta governada e reaproveitável, em vez de cada dashboard copiar SQL. O export materializa a métrica numa tabela (dbt Cloud / mf export); em core a definição é versionada e validada (mf validate-configs).</w:t>
+      </w:r>
+    </w:p>
+    <w:p>
+      <w:pPr>
+        <w:spacing w:after="100"/>
+      </w:pPr>
+      <w:r>
+        <w:rPr>
+          <w:b/>
+          <w:color w:val="1F4E79"/>
+        </w:rPr>
+        <w:t xml:space="preserve">ADR-27 — Slim CI (state:modified+ --defer): </w:t>
+      </w:r>
+      <w:r>
+        <w:t>Um workflow de PR (dbt_slim_ci.yml) constrói só o que mudou + downstream, deferindo o resto a um baseline (manifest da branch base). Reconstruir tudo a cada PR é caro; o Slim CI roda em segundos quando pouca coisa muda. Validado: dbt ls --select state:modified+ seleciona exatamente o model alterado. Em prod, o --defer aponta para o warehouse.</w:t>
       </w:r>
     </w:p>
     <w:p>

</xml_diff>

<commit_message>
feat: Fase 4 — ingestão (EL) com dlt; bronze deixa de ser seed
- NOVO projeto ingestion-toll-analytics: pipeline dlt lê arquivos de landing (CSV)
  e carrega no schema `landing` do DuckDB (merge/replace, metadados, ''->NULL)
- dbt: _sources.yml aponta para `landing` (+ freshness/testes); staging troca
  ref(seed) por source('toll_raw', ...); seeds removidos (config + _seeds.yml + CSVs)
- staging tipa o raw (cast); event_ts como texto na landing (schema-on-read)
- Airflow: task ingest_landing (dlt) antes de freshness->transform->docs
- CI (dbt_ci, dbt_docs, observability, slim_ci) roda dlt antes do dbt build;
  Makefile `build` depende de `ingest`; validate_local cria o venv da ingestão
- ADR-28 + doc Word regenerada (anti-drift: 28 ADRs, 27 arquivos)

Validado: dlt -> dbt build PASS=192 ERROR=0, auditoria 9 suspeitas (T0023 divergente);
dags test pipeline state=success (ingest_landing -> 9 suspeitas).

Co-Authored-By: Claude Opus 4.8 <noreply@anthropic.com>
</commit_message>
<xml_diff>
--- a/dbt-toll-analytics/docs/Documentacao_dbt_toll_analytics.docx
+++ b/dbt-toll-analytics/docs/Documentacao_dbt_toll_analytics.docx
@@ -1712,7 +1712,20 @@
         <w:rPr>
           <w:color w:val="1F4E79"/>
         </w:rPr>
-        <w:t>6.2. seeds/ — camada BRONZE (dados crus)</w:t>
+        <w:t>6.2. Ingestão (dlt) — camada BRONZE (landing)</w:t>
+      </w:r>
+    </w:p>
+    <w:p>
+      <w:pPr>
+        <w:spacing w:after="120"/>
+      </w:pPr>
+      <w:r>
+        <w:rPr>
+          <w:b w:val="0"/>
+          <w:i w:val="0"/>
+          <w:sz w:val="22"/>
+        </w:rPr>
+        <w:t>O bronze NÃO é mais seed (ADR-28): o projeto ingestion-toll-analytics usa o dlt para ler estes arquivos de landing (CSV) e carregá-los no schema 'landing' do DuckDB; o staging consome via source('toll_raw', ...). Os arquivos abaixo vivem em ingestion-toll-analytics/data/.</w:t>
       </w:r>
     </w:p>
     <w:p>
@@ -1944,7 +1957,7 @@
           <w:color w:val="1F4E79"/>
           <w:sz w:val="23"/>
         </w:rPr>
-        <w:t>_seeds.yml</w:t>
+        <w:t>toll_ingestion.py (dlt) + _sources.yml</w:t>
       </w:r>
     </w:p>
     <w:p>
@@ -1958,7 +1971,7 @@
         <w:t xml:space="preserve">O que é / para que serve: </w:t>
       </w:r>
       <w:r>
-        <w:t>Documenta e testa os seeds (chaves únicas, não-nulas, relacionamentos).</w:t>
+        <w:t>O pipeline dlt (projeto ingestion-toll-analytics) carrega os arquivos de landing no schema 'landing' (merge/replace, metadados de carga, '' -&gt; NULL); o _sources.yml declara a source toll_raw (schema landing) + freshness + testes.</w:t>
       </w:r>
     </w:p>
     <w:p>
@@ -1972,7 +1985,7 @@
         <w:t xml:space="preserve">Por que existe: </w:t>
       </w:r>
       <w:r>
-        <w:t>Garante a qualidade já na entrada — os testes pegam problemas o quanto antes.</w:t>
+        <w:t>É o EL antes do T (ADR-28): o staging troca ref(seed) por source('toll_raw', ...). Reprodutível offline (o dlt lê CSVs commitados).</w:t>
       </w:r>
     </w:p>
     <w:p>
@@ -4323,6 +4336,21 @@
       </w:r>
       <w:r>
         <w:t>Um workflow de PR (dbt_slim_ci.yml) constrói só o que mudou + downstream, deferindo o resto a um baseline (manifest da branch base). Reconstruir tudo a cada PR é caro; o Slim CI roda em segundos quando pouca coisa muda. Validado: dbt ls --select state:modified+ seleciona exatamente o model alterado. Em prod, o --defer aponta para o warehouse.</w:t>
+      </w:r>
+    </w:p>
+    <w:p>
+      <w:pPr>
+        <w:spacing w:after="100"/>
+      </w:pPr>
+      <w:r>
+        <w:rPr>
+          <w:b/>
+          <w:color w:val="1F4E79"/>
+        </w:rPr>
+        <w:t xml:space="preserve">ADR-28 — Ingestão (EL) com dlt; bronze deixa de ser seed: </w:t>
+      </w:r>
+      <w:r>
+        <w:t>Realiza o ADR-13: um pipeline dlt (projeto ingestion-toll-analytics) lê os arquivos de landing (CSV) e carrega no schema 'landing' do DuckDB (merge/replace, metadados de carga, '' -&gt; NULL). O staging passa a consumir via source('toll_raw', ...) em vez de seeds; os seeds foram removidos. Continua reprodutível offline (o dlt lê CSVs commitados, não uma API). O Airflow roda a ingestão antes do transform; o CI também (dlt -&gt; dbt build).</w:t>
       </w:r>
     </w:p>
     <w:p>

</xml_diff>